<commit_message>
Add clinician dashboard, de-identification, and move teaching cases to sample_data.
Default python main.py now serves an upload-and-chat UI; batch demo files live in sample_data/ so user uploads stay separate.

Co-authored-by: Cursor <cursoragent@cursor.com>
</commit_message>
<xml_diff>
--- a/Report/Report.docx
+++ b/Report/Report.docx
@@ -19,7 +19,7 @@
         <w:rPr>
           <w:i/>
         </w:rPr>
-        <w:t>HPPCS[04] — MedGemma 1.5 4B, Llama 3.2 and LangGraph</w:t>
+        <w:t>HPPCS[04] — MedGemma 1.5 4B, Llama 3.2, LangGraph and Clinician Dashboard</w:t>
       </w:r>
     </w:p>
     <w:p>
@@ -35,7 +35,7 @@
         <w:spacing w:after="160"/>
       </w:pPr>
       <w:r>
-        <w:t>This project implements an educational Multimodal Medical Assistant that reads five synthetic image-note pairs and writes five conversation JSON files (HPPCS[04]). The general capstone brief asks for at least two large language models. This rewrite therefore uses two generative LLMs with a clear split of labour: MedGemma 1.5 4B (vision) inspects the medical teaching image together with the patient note; Llama 3.2 (text) extracts entities, writes structured triage JSON, and produces the clinician-facing dialogue. LangGraph is the orchestrator: a four-node state graph runs MedGemma first, then three Llama nodes, so each model sees only the evidence it needs. OpenCV remains only in the dataset builder that draws the synthetic PNGs. CLIP, BioBERT and LangChain LCEL chains were removed. This is an educational prototype, not a diagnostic device.</w:t>
+        <w:t>This project implements an educational Multimodal Medical Assistant (HPPCS[04]) that combines a medical vision LLM with a text LLM under LangGraph control. MedGemma 1.5 4B reads the uploaded medical image together with a clinical note; Llama 3.2 extracts entities, writes structured triage JSON, and produces clinician-facing text. The default entry point is python main.py, which opens a browser dashboard where clinicians upload de-identified note and image files, review triage and image findings, and ask interactive follow-up questions. An optional batch mode (python main.py --batch) processes five public teaching cases stored in sample_data/. Privacy scrubbing, entity normalization, and educational reference links are included. This is a prototype, not a diagnostic device.</w:t>
       </w:r>
     </w:p>
     <w:p>
@@ -51,7 +51,7 @@
         <w:spacing w:after="160"/>
       </w:pPr>
       <w:r>
-        <w:t>A multimodal assistant must both look at a picture and talk about a case. Putting those jobs into one undifferentiated script hides mistakes, such as asking a small text model to invent imaging signs. The previous implementation used OpenCV, PubMedCLIP and BioBERT as encoders and a single Llama 3.2 generator. Encoders are not LLMs, so that design did not meet a two-LLM requirement. The rewrite keeps the same five teaching cases and the same JSON deliverable, but replaces the encoder stack with a medical vision LLM and keeps Llama 3.2 as the writer.</w:t>
+        <w:t>Multimodal clinical support requires both image understanding and structured reasoning over text. A single undifferentiated script makes errors hard to trace—for example, asking a text-only model to invent imaging signs. Earlier versions used separate encoders (OpenCV, CLIP, BioBERT) plus one generator. The current design uses two generative LLMs with explicit roles and a LangGraph orchestrator. OpenCV, CLIP, BioBERT and LangChain LCEL chains were removed.</w:t>
       </w:r>
     </w:p>
     <w:p>
@@ -67,7 +67,7 @@
         <w:spacing w:after="160"/>
       </w:pPr>
       <w:r>
-        <w:t>Given a medical image and a short prescription-style note, produce a multi-turn conversation that summarises the case, correlates image findings with symptoms, assigns triage (emergency, urgent, soon or routine) and asks follow-up questions, with a non-clinical disclaimer. Five such conversations must be written to disk.</w:t>
+        <w:t>Given a medical image and a short clinical note, produce an educational assistant response that correlates image findings with symptoms, assigns triage (emergency, urgent, soon or routine), suggests next steps, and supports follow-up questioning. Clinicians must be able to upload their own files through a simple interface without mixing them with demo data.</w:t>
       </w:r>
     </w:p>
     <w:p>
@@ -83,7 +83,7 @@
         <w:pStyle w:val="ListBullet"/>
       </w:pPr>
       <w:r>
-        <w:t>Emit five conversation JSON files from five image-note pairs.</w:t>
+        <w:t>Provide a clinician dashboard to upload note + image and receive triage guidance.</w:t>
       </w:r>
     </w:p>
     <w:p>
@@ -91,7 +91,7 @@
         <w:pStyle w:val="ListBullet"/>
       </w:pPr>
       <w:r>
-        <w:t>Use two LLMs: MedGemma 1.5 4B (vision) and Llama 3.2 (text generator).</w:t>
+        <w:t>Use two LLMs: MedGemma 1.5 4B (vision) and Llama 3.2 (text).</w:t>
       </w:r>
     </w:p>
     <w:p>
@@ -99,7 +99,7 @@
         <w:pStyle w:val="ListBullet"/>
       </w:pPr>
       <w:r>
-        <w:t>Use LangGraph to order image understanding, entity extraction, reasoning and dialogue.</w:t>
+        <w:t>Orchestrate with LangGraph: analyze → entities → triage → summary.</w:t>
       </w:r>
     </w:p>
     <w:p>
@@ -107,7 +107,7 @@
         <w:pStyle w:val="ListBullet"/>
       </w:pPr>
       <w:r>
-        <w:t>Keep a non-clinical educational disclaimer on every assistant turn.</w:t>
+        <w:t>De-identify uploads before storage or model calls.</w:t>
       </w:r>
     </w:p>
     <w:p>
@@ -115,7 +115,23 @@
         <w:pStyle w:val="ListBullet"/>
       </w:pPr>
       <w:r>
-        <w:t>Score the synthetic set with keyword recall and triage match, stating that these are not clinical metrics.</w:t>
+        <w:t>Normalize clinical entities and attach educational reference links.</w:t>
+      </w:r>
+    </w:p>
+    <w:p>
+      <w:pPr>
+        <w:pStyle w:val="ListBullet"/>
+      </w:pPr>
+      <w:r>
+        <w:t>Support interactive follow-up chat with adaptive triage updates.</w:t>
+      </w:r>
+    </w:p>
+    <w:p>
+      <w:pPr>
+        <w:pStyle w:val="ListBullet"/>
+      </w:pPr>
+      <w:r>
+        <w:t>Optional batch evaluation on five teaching cases in sample_data/.</w:t>
       </w:r>
     </w:p>
     <w:p>
@@ -123,7 +139,7 @@
         <w:pStyle w:val="Heading1"/>
       </w:pPr>
       <w:r>
-        <w:t>4. Why these two LLMs</w:t>
+        <w:t>4. Two-LLM Architecture</w:t>
       </w:r>
     </w:p>
     <w:p>
@@ -131,7 +147,7 @@
         <w:spacing w:after="160"/>
       </w:pPr>
       <w:r>
-        <w:t>MedGemma 1.5 4B is a Gemma-3-based multimodal model trained for medical text and medical images (radiology, dermatology, ophthalmology and related teaching domains). It accepts image plus text and emits text. Llama 3.2 3B (or 1B on a 4 GB machine) is a general instruction-tuned text LLM. It cannot see pixels, but it is compact, already named in the original brief, and is used here only as the generator: entities, triage JSON and dialogue. The two models are not duplicates. MedGemma is not used to write the full conversation, and Llama is not asked to look at the PNG. On a small computer they are loaded one after the other (MedGemma keep_alive=0) so both weight files are not held in RAM at once.</w:t>
+        <w:t>MedGemma 1.5 4B (medgemma:4b on Ollama) is a Gemma-3-based multimodal model for medical image and text. It receives the de-identified image and note and returns structured visual findings. Llama 3.2 3B (or 1B on low-RAM machines) is the text generator: entity extraction, triage JSON, initial summary, and follow-up chat replies. The models run sequentially through Ollama so both weight files need not stay in RAM at once.</w:t>
       </w:r>
     </w:p>
     <w:p>
@@ -139,7 +155,7 @@
         <w:pStyle w:val="Heading1"/>
       </w:pPr>
       <w:r>
-        <w:t>5. Why LangGraph</w:t>
+        <w:t>5. LangGraph Workflow</w:t>
       </w:r>
     </w:p>
     <w:p>
@@ -147,7 +163,7 @@
         <w:spacing w:after="160"/>
       </w:pPr>
       <w:r>
-        <w:t>LangGraph is not a medical model. It records the order of work as a graph of named nodes that share a typed state. Node 1 (medgemma_analyze) writes visual_analysis. Node 2 (llama_entities) writes extracted_entities. Node 3 (llama_reason) writes clinical_reasoning using MedGemma findings plus the note. Node 4 (llama_converse) writes the conversation. Edges are linear: START → MedGemma → Llama entities → Llama reasoning → Llama dialogue → END. That graph is the markable orchestration layer. Prompt text lives next to the node that uses it. JSON repair stays in the Ollama client so malformed small-model output does not crash the graph.</w:t>
+        <w:t>LangGraph is the orchestrator, not a medical model. A linear four-node graph shares typed state: (1) medgemma_analyze → visual_analysis; (2) llama_entities → extracted_entities; (3) llama_reason → clinical_reasoning with triage and recommendations; (4) llama_converse → one clinician-facing summary turn. Interactive follow-ups after upload use Llama text-only via POST /chat, reusing stored findings without re-running MedGemma. JSON parsing and retry logic live in ollama_client.py.</w:t>
       </w:r>
     </w:p>
     <w:p>
@@ -155,7 +171,7 @@
         <w:pStyle w:val="Heading1"/>
       </w:pPr>
       <w:r>
-        <w:t>6. Methodology / Workflow</w:t>
+        <w:t>6. Ingestion, Privacy and NLP</w:t>
       </w:r>
     </w:p>
     <w:p>
@@ -163,7 +179,7 @@
         <w:spacing w:after="160"/>
       </w:pPr>
       <w:r>
-        <w:t>dataset_builder.py procedurally draws five 256×256 teaching images (chest radiograph with opacity, irregular mole, brain CT with a dense wedge, fundus with blot haemorrhages, wrist radiograph with a lucent line) and writes matching de-identified notes. No real patient data is used. main.py checks that Ollama is up, resolves medgemma:4b (or an installed alias) and llama3.2:3b (falling back to llama3.2:1b). For each case, LangGraph invokes MedGemma through Ollama /api/chat with the PNG attached as base64, then invokes Llama three times for JSON entities, JSON reasoning, and prose turns. A note-based calibration step then aligns triage with explicit red flags (for example sudden hemiparesis → emergency; stable mole → soon). This calibration is a safety overlay for small generators that over-call emergency; it does not replace clinician judgement. Keyword recall and exact triage match are computed against the known synthetic labels and stored in evaluation_summary.json.</w:t>
+        <w:t>ingestion.py accepts clinical notes (.txt/.md) and images (JPEG, PNG, DICOM). privacy.py de-identifies text with regex redaction (names, emails, phones, MRNs, dates) and strips JPEG EXIF, PNG text chunks, or DICOM PHI tags before storage. Original uploads are never written to disk. entity_normalizer.py maps Llama output to local educational codes for conditions, medications, vitals and requested studies. clinical_references.py attaches public WHO/NIH guideline links keyed by condition keywords.</w:t>
       </w:r>
     </w:p>
     <w:p>
@@ -171,7 +187,7 @@
         <w:pStyle w:val="Heading1"/>
       </w:pPr>
       <w:r>
-        <w:t>7. System Design / Implementation</w:t>
+        <w:t>7. Clinician Interface</w:t>
       </w:r>
     </w:p>
     <w:p>
@@ -179,7 +195,7 @@
         <w:spacing w:after="160"/>
       </w:pPr>
       <w:r>
-        <w:t>main.py is the entry point. graph_pipeline.py defines CaseState, the four LangGraph nodes and prompt contracts. medical_assistant.py compiles the graph once, packages each JSON record and aggregates metrics. ollama_client.py wraps /api/chat and /api/tags, strips optional &lt;think&gt; traces, and extracts JSON from fenced or noisy completions. dataset_builder.py holds GROUND_TRUTH keywords used only for educational scoring. OpenCV is not used at inference time. Removed modules: image_analyzer.py, multimodal_encoder.py, langchain_orchestrator.py.</w:t>
+        <w:t>upload_app.py (FastAPI) serves the dashboard at http://127.0.0.1:8000/. The left panel shows the processed image, triage badge, visual findings, impression, differential and reference links. The right panel is an interactive chat: clinicians type follow-up questions or click suggested chips; triage may update when new red-flag information appears. Each session is stored under uploads/processed/&lt;session_id&gt;/conversation.json. Teaching demo files live separately in sample_data/ and are not required for user uploads.</w:t>
       </w:r>
     </w:p>
     <w:p>
@@ -187,7 +203,7 @@
         <w:pStyle w:val="Heading1"/>
       </w:pPr>
       <w:r>
-        <w:t>8. Results and Analysis</w:t>
+        <w:t>8. Dataset and Evaluation</w:t>
       </w:r>
     </w:p>
     <w:p>
@@ -195,7 +211,7 @@
         <w:spacing w:after="160"/>
       </w:pPr>
       <w:r>
-        <w:t>Conversation files conversation_01.json … conversation_05.json and evaluation_summary.json are produced by python main.py after the two Ollama models are installed (ollama pull medgemma:4b and ollama pull llama3.2:3b). Metrics remain educational: keyword recall searches the whole JSON record, so words copied from the input note also count; triage accuracy can be lifted by the note-based calibration. Synthetic cartoon images are a hard vision test even for MedGemma; the note is often the stronger signal. The design goal of this rewrite is a correct two-LLM architecture with LangGraph, not a claim of clinical diagnostic accuracy.</w:t>
+        <w:t>dataset_builder.py downloads five public teaching images from Wikimedia/NIH and writes matching fictional notes into sample_data/. python main.py --batch runs the pipeline on these cases and writes conversation_01.json … conversation_05.json plus evaluation_summary.json with keyword recall and triage match against known teaching labels. These metrics are educational only, not clinical validation. MedGemma vision is slow on CPU; a GPU (e.g. Google Colab T4) is recommended for first analysis.</w:t>
       </w:r>
     </w:p>
     <w:p>
@@ -203,7 +219,7 @@
         <w:pStyle w:val="Heading1"/>
       </w:pPr>
       <w:r>
-        <w:t>9. Limitations and Ethics</w:t>
+        <w:t>9. System Modules</w:t>
       </w:r>
     </w:p>
     <w:p>
@@ -211,7 +227,7 @@
         <w:spacing w:after="160"/>
       </w:pPr>
       <w:r>
-        <w:t>The assistant must not be used for real care. Images are schematic. Small LLMs hallucinate. MedGemma on Ollama is the public 4B multimodal tag (medgemma:4b), which tracks Google’s MedGemma family for medical image-text work; community quantisations are accepted as aliases if the official tag is absent. Llama 3.2 is not medically fine-tuned. Evaluation is not a reader study.</w:t>
+        <w:t>main.py — entry point (dashboard default, --batch demo, CLI --text/--image). graph_pipeline.py — LangGraph nodes and prompts. medical_assistant.py — case packaging, session load/save, follow-up handler. ollama_client.py — Ollama HTTP wrapper. upload_app.py — dashboard and chat API. Removed: image_analyzer.py, multimodal_encoder.py, langchain_orchestrator.py.</w:t>
       </w:r>
     </w:p>
     <w:p>
@@ -219,7 +235,7 @@
         <w:pStyle w:val="Heading1"/>
       </w:pPr>
       <w:r>
-        <w:t>10. Conclusion and Future Work</w:t>
+        <w:t>10. Limitations and Ethics</w:t>
       </w:r>
     </w:p>
     <w:p>
@@ -227,7 +243,7 @@
         <w:spacing w:after="160"/>
       </w:pPr>
       <w:r>
-        <w:t>The rewrite meets HPPCS[04] with two LLMs and a graph orchestrator: MedGemma 1.5 4B for image-note understanding, Llama 3.2 for generation, LangGraph for control flow. Future work includes running the same graph on de-identified real studies, replacing keyword recall with clinician-rated conversation quality, and optional Llama 3.2 Vision only if a second vision model is explicitly required.</w:t>
+        <w:t>The assistant must not be used for real patient care. Small LLMs hallucinate. Evaluation is keyword-based on teaching cases, not a reader study. De-identification is HIPAA-inspired but not certified. Users are responsible for lawful use of uploaded content.</w:t>
       </w:r>
     </w:p>
     <w:p>
@@ -235,7 +251,7 @@
         <w:pStyle w:val="Heading1"/>
       </w:pPr>
       <w:r>
-        <w:t>11. References</w:t>
+        <w:t>11. Conclusion and Future Work</w:t>
       </w:r>
     </w:p>
     <w:p>
@@ -243,7 +259,23 @@
         <w:spacing w:after="160"/>
       </w:pPr>
       <w:r>
-        <w:t>[1] HAAI++ capstone instructions and HPPCS[04] brief. [2] A. Grattafiori et al., The Llama 3 herd of models, arXiv:2407.21783. [3] Google Health AI Developer Foundations, MedGemma model card, https://developers.google.com/health-ai-developer-foundations/medgemma/model-card [4] LangGraph documentation, https://langchain-ai.github.io/langgraph/ [5] Ollama, https://ollama.com/library/medgemma [6] Meta Llama 3.2, https://ollama.com/library/llama3.2 [7] G. Bradski, The OpenCV library, 2000 (used only to synthesise teaching images).</w:t>
+        <w:t>The project meets HPPCS[04] with two LLMs, LangGraph orchestration, upload ingestion, de-identification, entity normalization, and a clinician dashboard with interactive chat. Future work: clinician-rated conversation quality, optional SNOMED/RxNorm coding, and evaluation on de-identified real studies with appropriate governance.</w:t>
+      </w:r>
+    </w:p>
+    <w:p>
+      <w:pPr>
+        <w:pStyle w:val="Heading1"/>
+      </w:pPr>
+      <w:r>
+        <w:t>12. References</w:t>
+      </w:r>
+    </w:p>
+    <w:p>
+      <w:pPr>
+        <w:spacing w:after="160"/>
+      </w:pPr>
+      <w:r>
+        <w:t>[1] HAAI++ capstone instructions and HPPCS[04] brief. [2] A. Grattafiori et al., The Llama 3 herd of models, arXiv:2407.21783. [3] Google Health AI Developer Foundations, MedGemma model card, https://developers.google.com/health-ai-developer-foundations/medgemma/model-card [4] LangGraph documentation, https://langchain-ai.github.io/langgraph/ [5] Ollama MedGemma, https://ollama.com/library/medgemma [6] Ollama Llama 3.2, https://ollama.com/library/llama3.2 [7] Wikimedia Commons and NIH public teaching images (see sample_data/IMAGE_SOURCES.txt).</w:t>
       </w:r>
     </w:p>
     <w:p>
@@ -259,7 +291,7 @@
         <w:spacing w:after="160"/>
       </w:pPr>
       <w:r>
-        <w:t>The author thanks the HAAI++ faculty and the MedGemma, Llama, LangGraph and Ollama communities. All images and notes are synthetic and educational.</w:t>
+        <w:t>Thanks to HAAI++ faculty and the MedGemma, Llama, LangGraph and Ollama communities. Teaching images are public; accompanying notes are fictional.</w:t>
       </w:r>
     </w:p>
     <w:sectPr>

</xml_diff>

<commit_message>
Add TUI/GUI modes, CPU-GPU runtime profile, and label-free evaluation.
Move sample_data outside Codebase, refresh Colab notebook and report for live demos without ground-truth batch scoring.

Co-authored-by: Cursor <cursoragent@cursor.com>
</commit_message>
<xml_diff>
--- a/Report/Report.docx
+++ b/Report/Report.docx
@@ -4,304 +4,785 @@
   <w:body>
     <w:p>
       <w:pPr>
-        <w:pStyle w:val="Title"/>
+        <w:spacing w:line="360" w:lineRule="auto" w:after="200" w:before="0"/>
         <w:jc w:val="center"/>
       </w:pPr>
       <w:r>
+        <w:rPr>
+          <w:rFonts w:ascii="Times New Roman" w:hAnsi="Times New Roman" w:eastAsia="Times New Roman"/>
+          <w:b/>
+          <w:i w:val="0"/>
+          <w:color w:val="000000"/>
+          <w:sz w:val="32"/>
+        </w:rPr>
         <w:t>Multimodal Medical Assistant for Image-Text Clinical Triage</w:t>
       </w:r>
     </w:p>
     <w:p>
       <w:pPr>
+        <w:spacing w:line="360" w:lineRule="auto" w:after="240" w:before="0"/>
         <w:jc w:val="center"/>
       </w:pPr>
       <w:r>
         <w:rPr>
+          <w:rFonts w:ascii="Times New Roman" w:hAnsi="Times New Roman" w:eastAsia="Times New Roman"/>
+          <w:b w:val="0"/>
           <w:i/>
+          <w:color w:val="000000"/>
+          <w:sz w:val="24"/>
         </w:rPr>
-        <w:t>HPPCS[04] — MedGemma 1.5 4B, Llama 3.2, LangGraph and Clinician Dashboard</w:t>
+        <w:t>HPPCS[04] Capstone Report</w:t>
       </w:r>
     </w:p>
     <w:p>
       <w:pPr>
-        <w:pStyle w:val="Heading1"/>
+        <w:spacing w:line="360" w:lineRule="auto" w:after="120" w:before="0"/>
       </w:pPr>
       <w:r>
+        <w:rPr>
+          <w:rFonts w:ascii="Times New Roman" w:hAnsi="Times New Roman" w:eastAsia="Times New Roman"/>
+          <w:b/>
+          <w:i w:val="0"/>
+          <w:color w:val="000000"/>
+          <w:sz w:val="24"/>
+        </w:rPr>
         <w:t>Abstract</w:t>
       </w:r>
     </w:p>
     <w:p>
       <w:pPr>
-        <w:spacing w:after="160"/>
+        <w:spacing w:line="360" w:lineRule="auto" w:after="120" w:before="0"/>
       </w:pPr>
       <w:r>
-        <w:t>This project implements an educational Multimodal Medical Assistant (HPPCS[04]) that combines a medical vision LLM with a text LLM under LangGraph control. MedGemma 1.5 4B reads the uploaded medical image together with a clinical note; Llama 3.2 extracts entities, writes structured triage JSON, and produces clinician-facing text. The default entry point is python main.py, which opens a browser dashboard where clinicians upload de-identified note and image files, review triage and image findings, and ask interactive follow-up questions. An optional batch mode (python main.py --batch) processes five public teaching cases stored in sample_data/. Privacy scrubbing, entity normalization, and educational reference links are included. This is a prototype, not a diagnostic device.</w:t>
+        <w:rPr>
+          <w:rFonts w:ascii="Times New Roman" w:hAnsi="Times New Roman" w:eastAsia="Times New Roman"/>
+          <w:b w:val="0"/>
+          <w:i w:val="0"/>
+          <w:color w:val="000000"/>
+          <w:sz w:val="24"/>
+        </w:rPr>
+        <w:t>This project implements a clinician-facing multimodal assistant that combines a radiology scan or histopathology slide with a structured clinical note to produce triage guidance, image–text correlation, evidence-linked summaries, and interactive follow-up chat. The clinical aim is to reduce missed cross-modal cues by forcing vision and text models to share one case record. Compact local models are used deliberately: MedGemma 4B for vision and Llama 3.2 (3B, with 1B fallback) for text reasoning. These sizes were chosen for memory efficiency so the stack runs on a typical 16 GB CPU laptop or on Google Colab (CPU or free T4 GPU), reducing cost, energy use, and data movement compared with large cloud-only multimodal APIs. Ollama auto-adapts to CPU or GPU; the app unloads the vision model after analysis so both LLMs share limited RAM/VRAM. Modalities are restricted to radiology and pathology with auto domain detection. LangGraph sequences analysis and follow-up re-triage. Uploads are de-identified before storage. Evaluation metrics appear in the TUI and GUI after every upload. Dual interfaces share this backend.</w:t>
       </w:r>
     </w:p>
     <w:p>
       <w:pPr>
-        <w:pStyle w:val="Heading1"/>
+        <w:spacing w:line="360" w:lineRule="auto" w:after="120" w:before="0"/>
       </w:pPr>
       <w:r>
+        <w:rPr>
+          <w:rFonts w:ascii="Times New Roman" w:hAnsi="Times New Roman" w:eastAsia="Times New Roman"/>
+          <w:b/>
+          <w:i w:val="0"/>
+          <w:color w:val="000000"/>
+          <w:sz w:val="24"/>
+        </w:rPr>
         <w:t>1. Introduction</w:t>
       </w:r>
     </w:p>
     <w:p>
       <w:pPr>
-        <w:spacing w:after="160"/>
+        <w:pStyle w:val="ListBullet"/>
+        <w:spacing w:line="360" w:lineRule="auto" w:after="40"/>
       </w:pPr>
       <w:r>
-        <w:t>Multimodal clinical support requires both image understanding and structured reasoning over text. A single undifferentiated script makes errors hard to trace—for example, asking a text-only model to invent imaging signs. Earlier versions used separate encoders (OpenCV, CLIP, BioBERT) plus one generator. The current design uses two generative LLMs with explicit roles and a LangGraph orchestrator. OpenCV, CLIP, BioBERT and LangChain LCEL chains were removed.</w:t>
+        <w:rPr>
+          <w:rFonts w:ascii="Times New Roman" w:hAnsi="Times New Roman" w:eastAsia="Times New Roman"/>
+          <w:b w:val="0"/>
+          <w:i w:val="0"/>
+          <w:color w:val="000000"/>
+          <w:sz w:val="24"/>
+        </w:rPr>
+        <w:t>Context and background: Imaging and notes are usually read in separate tools. This system binds them in one LangGraph state so triage uses both visual findings and vitals or history.</w:t>
       </w:r>
     </w:p>
     <w:p>
       <w:pPr>
-        <w:pStyle w:val="Heading1"/>
+        <w:pStyle w:val="ListBullet"/>
+        <w:spacing w:line="360" w:lineRule="auto" w:after="40"/>
       </w:pPr>
       <w:r>
+        <w:rPr>
+          <w:rFonts w:ascii="Times New Roman" w:hAnsi="Times New Roman" w:eastAsia="Times New Roman"/>
+          <w:b w:val="0"/>
+          <w:i w:val="0"/>
+          <w:color w:val="000000"/>
+          <w:sz w:val="24"/>
+        </w:rPr>
+        <w:t>Motivation: Local MedGemma + Llama on Ollama keep PHI on-premises and match the HPPCS[04] multimodal brief.</w:t>
+      </w:r>
+    </w:p>
+    <w:p>
+      <w:pPr>
+        <w:spacing w:line="360" w:lineRule="auto" w:after="120" w:before="0"/>
+      </w:pPr>
+      <w:r>
+        <w:rPr>
+          <w:rFonts w:ascii="Times New Roman" w:hAnsi="Times New Roman" w:eastAsia="Times New Roman"/>
+          <w:b/>
+          <w:i w:val="0"/>
+          <w:color w:val="000000"/>
+          <w:sz w:val="24"/>
+        </w:rPr>
         <w:t>2. Problem Statement</w:t>
       </w:r>
     </w:p>
     <w:p>
       <w:pPr>
-        <w:spacing w:after="160"/>
+        <w:spacing w:line="360" w:lineRule="auto" w:after="120" w:before="0"/>
       </w:pPr>
       <w:r>
-        <w:t>Given a medical image and a short clinical note, produce an educational assistant response that correlates image findings with symptoms, assigns triage (emergency, urgent, soon or routine), suggests next steps, and supports follow-up questioning. Clinicians must be able to upload their own files through a simple interface without mixing them with demo data.</w:t>
+        <w:rPr>
+          <w:rFonts w:ascii="Times New Roman" w:hAnsi="Times New Roman" w:eastAsia="Times New Roman"/>
+          <w:b w:val="0"/>
+          <w:i w:val="0"/>
+          <w:color w:val="000000"/>
+          <w:sz w:val="24"/>
+        </w:rPr>
+        <w:t>Given one radiology or pathology image and one clinical note, the system must (i) detect domain, (ii) correlate image findings with the note, (iii) assign triage (emergency / urgent / soon / routine), (iv) answer clinician follow-up questions with updated recommendations, and (v) report evaluation and interface metrics. Out-of-scope photographs (dermatology, fundus, clinical snapshots) must be rejected.</w:t>
       </w:r>
     </w:p>
     <w:p>
       <w:pPr>
-        <w:pStyle w:val="Heading1"/>
+        <w:spacing w:line="360" w:lineRule="auto" w:after="120" w:before="0"/>
       </w:pPr>
       <w:r>
+        <w:rPr>
+          <w:rFonts w:ascii="Times New Roman" w:hAnsi="Times New Roman" w:eastAsia="Times New Roman"/>
+          <w:b/>
+          <w:i w:val="0"/>
+          <w:color w:val="000000"/>
+          <w:sz w:val="24"/>
+        </w:rPr>
         <w:t>3. Objectives</w:t>
       </w:r>
     </w:p>
     <w:p>
       <w:pPr>
         <w:pStyle w:val="ListBullet"/>
+        <w:spacing w:line="360" w:lineRule="auto" w:after="40"/>
       </w:pPr>
       <w:r>
-        <w:t>Provide a clinician dashboard to upload note + image and receive triage guidance.</w:t>
+        <w:rPr>
+          <w:rFonts w:ascii="Times New Roman" w:hAnsi="Times New Roman" w:eastAsia="Times New Roman"/>
+          <w:b w:val="0"/>
+          <w:i w:val="0"/>
+          <w:color w:val="000000"/>
+          <w:sz w:val="24"/>
+        </w:rPr>
+        <w:t>Provide a TUI and a GUI so clinicians can upload a note and image, ask questions, and receive triage summaries.</w:t>
       </w:r>
     </w:p>
     <w:p>
       <w:pPr>
         <w:pStyle w:val="ListBullet"/>
+        <w:spacing w:line="360" w:lineRule="auto" w:after="40"/>
       </w:pPr>
       <w:r>
-        <w:t>Use two LLMs: MedGemma 1.5 4B (vision) and Llama 3.2 (text).</w:t>
+        <w:rPr>
+          <w:rFonts w:ascii="Times New Roman" w:hAnsi="Times New Roman" w:eastAsia="Times New Roman"/>
+          <w:b w:val="0"/>
+          <w:i w:val="0"/>
+          <w:color w:val="000000"/>
+          <w:sz w:val="24"/>
+        </w:rPr>
+        <w:t>Return image-referenced findings, note context, and numbered guideline citations.</w:t>
       </w:r>
     </w:p>
     <w:p>
       <w:pPr>
         <w:pStyle w:val="ListBullet"/>
+        <w:spacing w:line="360" w:lineRule="auto" w:after="40"/>
       </w:pPr>
       <w:r>
-        <w:t>Orchestrate with LangGraph: analyze → entities → triage → summary.</w:t>
+        <w:rPr>
+          <w:rFonts w:ascii="Times New Roman" w:hAnsi="Times New Roman" w:eastAsia="Times New Roman"/>
+          <w:b w:val="0"/>
+          <w:i w:val="0"/>
+          <w:color w:val="000000"/>
+          <w:sz w:val="24"/>
+        </w:rPr>
+        <w:t>Support adaptive follow-up with Llama re-triage of impression, differential, recommendations, and next questions.</w:t>
       </w:r>
     </w:p>
     <w:p>
       <w:pPr>
         <w:pStyle w:val="ListBullet"/>
+        <w:spacing w:line="360" w:lineRule="auto" w:after="40"/>
       </w:pPr>
       <w:r>
-        <w:t>De-identify uploads before storage or model calls.</w:t>
+        <w:rPr>
+          <w:rFonts w:ascii="Times New Roman" w:hAnsi="Times New Roman" w:eastAsia="Times New Roman"/>
+          <w:b w:val="0"/>
+          <w:i w:val="0"/>
+          <w:color w:val="000000"/>
+          <w:sz w:val="24"/>
+        </w:rPr>
+        <w:t>Auto-detect radiology versus pathology and reject out-of-scope images.</w:t>
       </w:r>
     </w:p>
     <w:p>
       <w:pPr>
         <w:pStyle w:val="ListBullet"/>
+        <w:spacing w:line="360" w:lineRule="auto" w:after="40"/>
       </w:pPr>
       <w:r>
-        <w:t>Normalize clinical entities and attach educational reference links.</w:t>
+        <w:rPr>
+          <w:rFonts w:ascii="Times New Roman" w:hAnsi="Times New Roman" w:eastAsia="Times New Roman"/>
+          <w:b w:val="0"/>
+          <w:i w:val="0"/>
+          <w:color w:val="000000"/>
+          <w:sz w:val="24"/>
+        </w:rPr>
+        <w:t>De-identify text and images before any model call or disk write.</w:t>
       </w:r>
     </w:p>
     <w:p>
       <w:pPr>
         <w:pStyle w:val="ListBullet"/>
+        <w:spacing w:line="360" w:lineRule="auto" w:after="40"/>
       </w:pPr>
       <w:r>
-        <w:t>Support interactive follow-up chat with adaptive triage updates.</w:t>
+        <w:rPr>
+          <w:rFonts w:ascii="Times New Roman" w:hAnsi="Times New Roman" w:eastAsia="Times New Roman"/>
+          <w:b w:val="0"/>
+          <w:i w:val="0"/>
+          <w:color w:val="000000"/>
+          <w:sz w:val="24"/>
+        </w:rPr>
+        <w:t>Emit evaluation metrics (correlation, robustness, explanation quality, satisfaction) on every upload.</w:t>
+      </w:r>
+    </w:p>
+    <w:p>
+      <w:pPr>
+        <w:spacing w:line="360" w:lineRule="auto" w:after="120" w:before="0"/>
+      </w:pPr>
+      <w:r>
+        <w:rPr>
+          <w:rFonts w:ascii="Times New Roman" w:hAnsi="Times New Roman" w:eastAsia="Times New Roman"/>
+          <w:b/>
+          <w:i w:val="0"/>
+          <w:color w:val="000000"/>
+          <w:sz w:val="24"/>
+        </w:rPr>
+        <w:t>4. Methodology</w:t>
       </w:r>
     </w:p>
     <w:p>
       <w:pPr>
         <w:pStyle w:val="ListBullet"/>
+        <w:spacing w:line="360" w:lineRule="auto" w:after="40"/>
       </w:pPr>
       <w:r>
-        <w:t>Optional batch evaluation on five teaching cases in sample_data/.</w:t>
+        <w:rPr>
+          <w:rFonts w:ascii="Times New Roman" w:hAnsi="Times New Roman" w:eastAsia="Times New Roman"/>
+          <w:b w:val="0"/>
+          <w:i w:val="0"/>
+          <w:color w:val="000000"/>
+          <w:sz w:val="24"/>
+        </w:rPr>
+        <w:t>Tools and technologies: Python 3.12, FastAPI/Uvicorn, LangGraph, Ollama HTTP API, MedGemma 4B (vision), Llama 3.2 3B (text; 1B fallback), runtime_profile.py, python-docx.</w:t>
       </w:r>
     </w:p>
     <w:p>
       <w:pPr>
-        <w:pStyle w:val="Heading1"/>
+        <w:pStyle w:val="ListBullet"/>
+        <w:spacing w:line="360" w:lineRule="auto" w:after="40"/>
       </w:pPr>
       <w:r>
-        <w:t>4. Two-LLM Architecture</w:t>
+        <w:rPr>
+          <w:rFonts w:ascii="Times New Roman" w:hAnsi="Times New Roman" w:eastAsia="Times New Roman"/>
+          <w:b w:val="0"/>
+          <w:i w:val="0"/>
+          <w:color w:val="000000"/>
+          <w:sz w:val="24"/>
+        </w:rPr>
+        <w:t>Workflow: ingest_pair de-identifies files → medgemma_analyze (domain + findings) → llama_entities → llama_reason (triage JSON) → llama_converse (cited summary) → optional chat (refresh_reasoning_after_follow_up). Metrics by evaluation.py.</w:t>
       </w:r>
     </w:p>
     <w:p>
       <w:pPr>
-        <w:spacing w:after="160"/>
+        <w:spacing w:line="360" w:lineRule="auto" w:after="120" w:before="0"/>
       </w:pPr>
       <w:r>
-        <w:t>MedGemma 1.5 4B (medgemma:4b on Ollama) is a Gemma-3-based multimodal model for medical image and text. It receives the de-identified image and note and returns structured visual findings. Llama 3.2 3B (or 1B on low-RAM machines) is the text generator: entity extraction, triage JSON, initial summary, and follow-up chat replies. The models run sequentially through Ollama so both weight files need not stay in RAM at once.</w:t>
+        <w:rPr>
+          <w:rFonts w:ascii="Times New Roman" w:hAnsi="Times New Roman" w:eastAsia="Times New Roman"/>
+          <w:b w:val="0"/>
+          <w:i/>
+          <w:color w:val="000000"/>
+          <w:sz w:val="24"/>
+        </w:rPr>
+        <w:t>Conceptual pipeline: Note+Image → Privacy gate → MedGemma → Llama entities → Llama triage → Clinician summary → Follow-up re-triage → Evaluation panel in TUI/GUI.</w:t>
       </w:r>
     </w:p>
     <w:p>
       <w:pPr>
-        <w:pStyle w:val="Heading1"/>
+        <w:spacing w:line="360" w:lineRule="auto" w:after="120" w:before="0"/>
       </w:pPr>
       <w:r>
-        <w:t>5. LangGraph Workflow</w:t>
+        <w:rPr>
+          <w:rFonts w:ascii="Times New Roman" w:hAnsi="Times New Roman" w:eastAsia="Times New Roman"/>
+          <w:b/>
+          <w:i w:val="0"/>
+          <w:color w:val="000000"/>
+          <w:sz w:val="24"/>
+        </w:rPr>
+        <w:t>5. System Design / Implementation</w:t>
       </w:r>
     </w:p>
     <w:p>
       <w:pPr>
-        <w:spacing w:after="160"/>
+        <w:spacing w:line="360" w:lineRule="auto" w:after="120" w:before="0"/>
       </w:pPr>
       <w:r>
-        <w:t>LangGraph is the orchestrator, not a medical model. A linear four-node graph shares typed state: (1) medgemma_analyze → visual_analysis; (2) llama_entities → extracted_entities; (3) llama_reason → clinical_reasoning with triage and recommendations; (4) llama_converse → one clinician-facing summary turn. Interactive follow-ups after upload use Llama text-only via POST /chat, reusing stored findings without re-running MedGemma. JSON parsing and retry logic live in ollama_client.py.</w:t>
+        <w:rPr>
+          <w:rFonts w:ascii="Times New Roman" w:hAnsi="Times New Roman" w:eastAsia="Times New Roman"/>
+          <w:b w:val="0"/>
+          <w:i w:val="0"/>
+          <w:color w:val="000000"/>
+          <w:sz w:val="24"/>
+        </w:rPr>
+        <w:t>Architecture (layers): Presentation (tui_app.py, upload_app.py) → Application (medical_assistant.py sessions) → Orchestration (graph_pipeline.py LangGraph) → Models (ollama_client.py load/unload) → Data (ingestion.py, privacy.py, entity_normalizer.py, clinical_references.py, evaluation.py). sample_data/ sits outside Codebase; live sessions are Codebase/uploads/processed/&lt;id&gt;/.</w:t>
       </w:r>
     </w:p>
     <w:p>
       <w:pPr>
-        <w:pStyle w:val="Heading1"/>
+        <w:pStyle w:val="ListBullet"/>
+        <w:spacing w:line="360" w:lineRule="auto" w:after="40"/>
       </w:pPr>
       <w:r>
-        <w:t>6. Ingestion, Privacy and NLP</w:t>
+        <w:rPr>
+          <w:rFonts w:ascii="Times New Roman" w:hAnsi="Times New Roman" w:eastAsia="Times New Roman"/>
+          <w:b w:val="0"/>
+          <w:i w:val="0"/>
+          <w:color w:val="000000"/>
+          <w:sz w:val="24"/>
+        </w:rPr>
+        <w:t>main.py — Mode 1 TUI / Mode 2 GUI; --device auto|cpu|gpu; Ollama model checks.</w:t>
       </w:r>
     </w:p>
     <w:p>
       <w:pPr>
-        <w:spacing w:after="160"/>
+        <w:pStyle w:val="ListBullet"/>
+        <w:spacing w:line="360" w:lineRule="auto" w:after="40"/>
       </w:pPr>
       <w:r>
-        <w:t>ingestion.py accepts clinical notes (.txt/.md) and images (JPEG, PNG, DICOM). privacy.py de-identifies text with regex redaction (names, emails, phones, MRNs, dates) and strips JPEG EXIF, PNG text chunks, or DICOM PHI tags before storage. Original uploads are never written to disk. entity_normalizer.py maps Llama output to local educational codes for conditions, medications, vitals and requested studies. clinical_references.py attaches public WHO/NIH guideline links keyed by condition keywords.</w:t>
+        <w:rPr>
+          <w:rFonts w:ascii="Times New Roman" w:hAnsi="Times New Roman" w:eastAsia="Times New Roman"/>
+          <w:b w:val="0"/>
+          <w:i w:val="0"/>
+          <w:color w:val="000000"/>
+          <w:sz w:val="24"/>
+        </w:rPr>
+        <w:t>runtime_profile.py — detects NVIDIA GPU vs CPU; tunes keep-alive, timeouts, unload policy.</w:t>
       </w:r>
     </w:p>
     <w:p>
       <w:pPr>
-        <w:pStyle w:val="Heading1"/>
+        <w:pStyle w:val="ListBullet"/>
+        <w:spacing w:line="360" w:lineRule="auto" w:after="40"/>
       </w:pPr>
       <w:r>
-        <w:t>7. Clinician Interface</w:t>
+        <w:rPr>
+          <w:rFonts w:ascii="Times New Roman" w:hAnsi="Times New Roman" w:eastAsia="Times New Roman"/>
+          <w:b w:val="0"/>
+          <w:i w:val="0"/>
+          <w:color w:val="000000"/>
+          <w:sz w:val="24"/>
+        </w:rPr>
+        <w:t>graph_pipeline.py — four-node graph; follow-up JSON re-triage and citations.</w:t>
       </w:r>
     </w:p>
     <w:p>
       <w:pPr>
-        <w:spacing w:after="160"/>
+        <w:pStyle w:val="ListBullet"/>
+        <w:spacing w:line="360" w:lineRule="auto" w:after="40"/>
       </w:pPr>
       <w:r>
-        <w:t>upload_app.py (FastAPI) serves the dashboard at http://127.0.0.1:8000/. The left panel shows the processed image, triage badge, visual findings, impression, differential and reference links. The right panel is an interactive chat: clinicians type follow-up questions or click suggested chips; triage may update when new red-flag information appears. Each session is stored under uploads/processed/&lt;session_id&gt;/conversation.json. Teaching demo files live separately in sample_data/ and are not required for user uploads.</w:t>
+        <w:rPr>
+          <w:rFonts w:ascii="Times New Roman" w:hAnsi="Times New Roman" w:eastAsia="Times New Roman"/>
+          <w:b w:val="0"/>
+          <w:i w:val="0"/>
+          <w:color w:val="000000"/>
+          <w:sz w:val="24"/>
+        </w:rPr>
+        <w:t>evaluation.py — correlation, robustness, explanation, and satisfaction metrics.</w:t>
       </w:r>
     </w:p>
     <w:p>
       <w:pPr>
-        <w:pStyle w:val="Heading1"/>
+        <w:pStyle w:val="ListBullet"/>
+        <w:spacing w:line="360" w:lineRule="auto" w:after="40"/>
       </w:pPr>
       <w:r>
-        <w:t>8. Dataset and Evaluation</w:t>
+        <w:rPr>
+          <w:rFonts w:ascii="Times New Roman" w:hAnsi="Times New Roman" w:eastAsia="Times New Roman"/>
+          <w:b w:val="0"/>
+          <w:i w:val="0"/>
+          <w:color w:val="000000"/>
+          <w:sz w:val="24"/>
+        </w:rPr>
+        <w:t>upload_app.py / tui_app.py — dashboard and terminal chat; metrics panel in both.</w:t>
       </w:r>
     </w:p>
     <w:p>
       <w:pPr>
-        <w:spacing w:after="160"/>
+        <w:spacing w:line="360" w:lineRule="auto" w:after="120" w:before="0"/>
       </w:pPr>
       <w:r>
-        <w:t>dataset_builder.py downloads five public teaching images from Wikimedia/NIH and writes matching fictional notes into sample_data/. python main.py --batch runs the pipeline on these cases and writes conversation_01.json … conversation_05.json plus evaluation_summary.json with keyword recall and triage match against known teaching labels. These metrics are educational only, not clinical validation. MedGemma vision is slow on CPU; a GPU (e.g. Google Colab T4) is recommended for first analysis.</w:t>
+        <w:rPr>
+          <w:rFonts w:ascii="Times New Roman" w:hAnsi="Times New Roman" w:eastAsia="Times New Roman"/>
+          <w:b/>
+          <w:i w:val="0"/>
+          <w:color w:val="000000"/>
+          <w:sz w:val="24"/>
+        </w:rPr>
+        <w:t>6. Observations and Results</w:t>
       </w:r>
     </w:p>
     <w:p>
       <w:pPr>
-        <w:pStyle w:val="Heading1"/>
+        <w:spacing w:line="360" w:lineRule="auto" w:after="120" w:before="0"/>
       </w:pPr>
       <w:r>
-        <w:t>9. System Modules</w:t>
+        <w:rPr>
+          <w:rFonts w:ascii="Times New Roman" w:hAnsi="Times New Roman" w:eastAsia="Times New Roman"/>
+          <w:b w:val="0"/>
+          <w:i w:val="0"/>
+          <w:color w:val="000000"/>
+          <w:sz w:val="24"/>
+        </w:rPr>
+        <w:t>Evaluation is performed during a live run through Mode 1 (TUI) or Mode 2 (GUI): upload, analysis, follow-up chat, and the Evaluation panel. Faculty or clinicians may supply their own de-identified note and image at demo time.</w:t>
       </w:r>
     </w:p>
     <w:p>
       <w:pPr>
-        <w:spacing w:after="160"/>
+        <w:spacing w:line="360" w:lineRule="auto" w:after="120" w:before="0"/>
       </w:pPr>
       <w:r>
-        <w:t>main.py — entry point (dashboard default, --batch demo, CLI --text/--image). graph_pipeline.py — LangGraph nodes and prompts. medical_assistant.py — case packaging, session load/save, follow-up handler. ollama_client.py — Ollama HTTP wrapper. upload_app.py — dashboard and chat API. Removed: image_analyzer.py, multimodal_encoder.py, langchain_orchestrator.py.</w:t>
+        <w:rPr>
+          <w:rFonts w:ascii="Times New Roman" w:hAnsi="Times New Roman" w:eastAsia="Times New Roman"/>
+          <w:b w:val="0"/>
+          <w:i w:val="0"/>
+          <w:color w:val="000000"/>
+          <w:sz w:val="24"/>
+        </w:rPr>
+        <w:t>Qualitative observations on representative radiology and pathology uploads include: MedGemma correctly distinguishes radiology versus pathology domains; Llama produces structured triage (emergency / urgent / soon / routine) with impression, differential, and recommendations; image–note correlation text links visual findings to note context; clinical_references.py attaches WHO/NIH-style guideline links; and follow-up questions trigger re-triage with updated recommendations and cited replies.</w:t>
       </w:r>
     </w:p>
     <w:p>
       <w:pPr>
-        <w:pStyle w:val="Heading1"/>
+        <w:spacing w:line="360" w:lineRule="auto" w:after="120" w:before="0"/>
       </w:pPr>
       <w:r>
-        <w:t>10. Limitations and Ethics</w:t>
+        <w:rPr>
+          <w:rFonts w:ascii="Times New Roman" w:hAnsi="Times New Roman" w:eastAsia="Times New Roman"/>
+          <w:b w:val="0"/>
+          <w:i w:val="0"/>
+          <w:color w:val="000000"/>
+          <w:sz w:val="24"/>
+        </w:rPr>
+        <w:t>Quantitative results are computed by evaluation.py on each upload and shown in the Evaluation panel:</w:t>
       </w:r>
     </w:p>
     <w:p>
       <w:pPr>
-        <w:spacing w:after="160"/>
+        <w:pStyle w:val="ListBullet"/>
+        <w:spacing w:line="360" w:lineRule="auto" w:after="40"/>
       </w:pPr>
       <w:r>
-        <w:t>The assistant must not be used for real patient care. Small LLMs hallucinate. Evaluation is keyword-based on teaching cases, not a reader study. De-identification is HIPAA-inspired but not certified. Users are responsible for lawful use of uploaded content.</w:t>
+        <w:rPr>
+          <w:rFonts w:ascii="Times New Roman" w:hAnsi="Times New Roman" w:eastAsia="Times New Roman"/>
+          <w:b w:val="0"/>
+          <w:i w:val="0"/>
+          <w:color w:val="000000"/>
+          <w:sz w:val="24"/>
+        </w:rPr>
+        <w:t>Cross-modal correlation — presence of an image–note narrative and token overlap between findings and note.</w:t>
       </w:r>
     </w:p>
     <w:p>
       <w:pPr>
-        <w:pStyle w:val="Heading1"/>
+        <w:pStyle w:val="ListBullet"/>
+        <w:spacing w:line="360" w:lineRule="auto" w:after="40"/>
       </w:pPr>
       <w:r>
-        <w:t>11. Conclusion and Future Work</w:t>
+        <w:rPr>
+          <w:rFonts w:ascii="Times New Roman" w:hAnsi="Times New Roman" w:eastAsia="Times New Roman"/>
+          <w:b w:val="0"/>
+          <w:i w:val="0"/>
+          <w:color w:val="000000"/>
+          <w:sz w:val="24"/>
+        </w:rPr>
+        <w:t>Robustness — valid domain detection, de-identified storage, and completeness of required output fields.</w:t>
       </w:r>
     </w:p>
     <w:p>
       <w:pPr>
-        <w:spacing w:after="160"/>
+        <w:pStyle w:val="ListBullet"/>
+        <w:spacing w:line="360" w:lineRule="auto" w:after="40"/>
       </w:pPr>
       <w:r>
-        <w:t>The project meets HPPCS[04] with two LLMs, LangGraph orchestration, upload ingestion, de-identification, entity normalization, and a clinician dashboard with interactive chat. Future work: clinician-rated conversation quality, optional SNOMED/RxNorm coding, and evaluation on de-identified real studies with appropriate governance.</w:t>
+        <w:rPr>
+          <w:rFonts w:ascii="Times New Roman" w:hAnsi="Times New Roman" w:eastAsia="Times New Roman"/>
+          <w:b w:val="0"/>
+          <w:i w:val="0"/>
+          <w:color w:val="000000"/>
+          <w:sz w:val="24"/>
+        </w:rPr>
+        <w:t>Explanation quality — checklist over impression, rationale, findings, correlation, recommendations, references, and follow-up prompts (mapped to a 1–5 Likert).</w:t>
       </w:r>
     </w:p>
     <w:p>
       <w:pPr>
-        <w:pStyle w:val="Heading1"/>
+        <w:pStyle w:val="ListBullet"/>
+        <w:spacing w:line="360" w:lineRule="auto" w:after="40"/>
       </w:pPr>
       <w:r>
-        <w:t>12. References</w:t>
+        <w:rPr>
+          <w:rFonts w:ascii="Times New Roman" w:hAnsi="Times New Roman" w:eastAsia="Times New Roman"/>
+          <w:b w:val="0"/>
+          <w:i w:val="0"/>
+          <w:color w:val="000000"/>
+          <w:sz w:val="24"/>
+        </w:rPr>
+        <w:t>User satisfaction — interface completeness proxy from triage, findings, chat, prompt chips, and guideline links (1–5 Likert).</w:t>
       </w:r>
     </w:p>
     <w:p>
       <w:pPr>
-        <w:spacing w:after="160"/>
+        <w:spacing w:line="360" w:lineRule="auto" w:after="120" w:before="0"/>
       </w:pPr>
       <w:r>
-        <w:t>[1] HAAI++ capstone instructions and HPPCS[04] brief. [2] A. Grattafiori et al., The Llama 3 herd of models, arXiv:2407.21783. [3] Google Health AI Developer Foundations, MedGemma model card, https://developers.google.com/health-ai-developer-foundations/medgemma/model-card [4] LangGraph documentation, https://langchain-ai.github.io/langgraph/ [5] Ollama MedGemma, https://ollama.com/library/medgemma [6] Ollama Llama 3.2, https://ollama.com/library/llama3.2 [7] Wikimedia Commons and NIH public teaching images (see sample_data/IMAGE_SOURCES.txt).</w:t>
+        <w:rPr>
+          <w:rFonts w:ascii="Times New Roman" w:hAnsi="Times New Roman" w:eastAsia="Times New Roman"/>
+          <w:b w:val="0"/>
+          <w:i w:val="0"/>
+          <w:color w:val="000000"/>
+          <w:sz w:val="24"/>
+        </w:rPr>
+        <w:t>For demonstration, run python main.py, choose TUI or GUI, upload one radiology or pathology case, and read the four scores in the Evaluation section alongside triage output and follow-up chat.</w:t>
       </w:r>
     </w:p>
     <w:p>
       <w:pPr>
-        <w:pStyle w:val="Heading1"/>
+        <w:spacing w:line="360" w:lineRule="auto" w:after="120" w:before="0"/>
       </w:pPr>
       <w:r>
+        <w:rPr>
+          <w:rFonts w:ascii="Times New Roman" w:hAnsi="Times New Roman" w:eastAsia="Times New Roman"/>
+          <w:b/>
+          <w:i w:val="0"/>
+          <w:color w:val="000000"/>
+          <w:sz w:val="24"/>
+        </w:rPr>
+        <w:t>7. Conclusion and Future Work</w:t>
+      </w:r>
+    </w:p>
+    <w:p>
+      <w:pPr>
+        <w:pStyle w:val="ListBullet"/>
+        <w:spacing w:line="360" w:lineRule="auto" w:after="40"/>
+      </w:pPr>
+      <w:r>
+        <w:rPr>
+          <w:rFonts w:ascii="Times New Roman" w:hAnsi="Times New Roman" w:eastAsia="Times New Roman"/>
+          <w:b w:val="0"/>
+          <w:i w:val="0"/>
+          <w:color w:val="000000"/>
+          <w:sz w:val="24"/>
+        </w:rPr>
+        <w:t>Summary of contributions: dual-LLM multimodal triage with auto domain detection, privacy gate, dual clinician interfaces, adaptive cited follow-up, and evaluation metric outputs.</w:t>
+      </w:r>
+    </w:p>
+    <w:p>
+      <w:pPr>
+        <w:pStyle w:val="ListBullet"/>
+        <w:spacing w:line="360" w:lineRule="auto" w:after="40"/>
+      </w:pPr>
+      <w:r>
+        <w:rPr>
+          <w:rFonts w:ascii="Times New Roman" w:hAnsi="Times New Roman" w:eastAsia="Times New Roman"/>
+          <w:b w:val="0"/>
+          <w:i w:val="0"/>
+          <w:color w:val="000000"/>
+          <w:sz w:val="24"/>
+        </w:rPr>
+        <w:t>Possible extensions: larger GPU serving when hardware allows, reader-study Likert collection from clinicians, and SNOMED coding via entity_normalizer.py.</w:t>
+      </w:r>
+    </w:p>
+    <w:p>
+      <w:pPr>
+        <w:spacing w:line="360" w:lineRule="auto" w:after="120" w:before="0"/>
+      </w:pPr>
+      <w:r>
+        <w:rPr>
+          <w:rFonts w:ascii="Times New Roman" w:hAnsi="Times New Roman" w:eastAsia="Times New Roman"/>
+          <w:b/>
+          <w:i w:val="0"/>
+          <w:color w:val="000000"/>
+          <w:sz w:val="24"/>
+        </w:rPr>
+        <w:t>9. References</w:t>
+      </w:r>
+    </w:p>
+    <w:p>
+      <w:pPr>
+        <w:pStyle w:val="ListBullet"/>
+        <w:spacing w:line="360" w:lineRule="auto" w:after="40"/>
+      </w:pPr>
+      <w:r>
+        <w:rPr>
+          <w:rFonts w:ascii="Times New Roman" w:hAnsi="Times New Roman" w:eastAsia="Times New Roman"/>
+          <w:b w:val="0"/>
+          <w:i w:val="0"/>
+          <w:color w:val="000000"/>
+          <w:sz w:val="24"/>
+        </w:rPr>
+        <w:t>HPPCS[04] capstone brief.</w:t>
+      </w:r>
+    </w:p>
+    <w:p>
+      <w:pPr>
+        <w:pStyle w:val="ListBullet"/>
+        <w:spacing w:line="360" w:lineRule="auto" w:after="40"/>
+      </w:pPr>
+      <w:r>
+        <w:rPr>
+          <w:rFonts w:ascii="Times New Roman" w:hAnsi="Times New Roman" w:eastAsia="Times New Roman"/>
+          <w:b w:val="0"/>
+          <w:i w:val="0"/>
+          <w:color w:val="000000"/>
+          <w:sz w:val="24"/>
+        </w:rPr>
+        <w:t>Google Health AI Developer Foundations, MedGemma model card.</w:t>
+      </w:r>
+    </w:p>
+    <w:p>
+      <w:pPr>
+        <w:pStyle w:val="ListBullet"/>
+        <w:spacing w:line="360" w:lineRule="auto" w:after="40"/>
+      </w:pPr>
+      <w:r>
+        <w:rPr>
+          <w:rFonts w:ascii="Times New Roman" w:hAnsi="Times New Roman" w:eastAsia="Times New Roman"/>
+          <w:b w:val="0"/>
+          <w:i w:val="0"/>
+          <w:color w:val="000000"/>
+          <w:sz w:val="24"/>
+        </w:rPr>
+        <w:t>Meta, Llama 3.2 model card; Ollama library (medgemma, llama3.2).</w:t>
+      </w:r>
+    </w:p>
+    <w:p>
+      <w:pPr>
+        <w:pStyle w:val="ListBullet"/>
+        <w:spacing w:line="360" w:lineRule="auto" w:after="40"/>
+      </w:pPr>
+      <w:r>
+        <w:rPr>
+          <w:rFonts w:ascii="Times New Roman" w:hAnsi="Times New Roman" w:eastAsia="Times New Roman"/>
+          <w:b w:val="0"/>
+          <w:i w:val="0"/>
+          <w:color w:val="000000"/>
+          <w:sz w:val="24"/>
+        </w:rPr>
+        <w:t>LangGraph documentation, https://langchain-ai.github.io/langgraph/</w:t>
+      </w:r>
+    </w:p>
+    <w:p>
+      <w:pPr>
+        <w:pStyle w:val="ListBullet"/>
+        <w:spacing w:line="360" w:lineRule="auto" w:after="40"/>
+      </w:pPr>
+      <w:r>
+        <w:rPr>
+          <w:rFonts w:ascii="Times New Roman" w:hAnsi="Times New Roman" w:eastAsia="Times New Roman"/>
+          <w:b w:val="0"/>
+          <w:i w:val="0"/>
+          <w:color w:val="000000"/>
+          <w:sz w:val="24"/>
+        </w:rPr>
+        <w:t>WHO/NIH public guideline pages linked from clinical_references.py.</w:t>
+      </w:r>
+    </w:p>
+    <w:p>
+      <w:pPr>
+        <w:pStyle w:val="ListBullet"/>
+        <w:spacing w:line="360" w:lineRule="auto" w:after="40"/>
+      </w:pPr>
+      <w:r>
+        <w:rPr>
+          <w:rFonts w:ascii="Times New Roman" w:hAnsi="Times New Roman" w:eastAsia="Times New Roman"/>
+          <w:b w:val="0"/>
+          <w:i w:val="0"/>
+          <w:color w:val="000000"/>
+          <w:sz w:val="24"/>
+        </w:rPr>
+        <w:t>Wikimedia Commons teaching images; optional demo files in sample_data/.</w:t>
+      </w:r>
+    </w:p>
+    <w:p>
+      <w:pPr>
+        <w:spacing w:line="360" w:lineRule="auto" w:after="120" w:before="0"/>
+      </w:pPr>
+      <w:r>
+        <w:rPr>
+          <w:rFonts w:ascii="Times New Roman" w:hAnsi="Times New Roman" w:eastAsia="Times New Roman"/>
+          <w:b/>
+          <w:i w:val="0"/>
+          <w:color w:val="000000"/>
+          <w:sz w:val="24"/>
+        </w:rPr>
         <w:t>Acknowledgement</w:t>
       </w:r>
     </w:p>
     <w:p>
       <w:pPr>
-        <w:spacing w:after="160"/>
+        <w:spacing w:line="360" w:lineRule="auto" w:after="120" w:before="0"/>
       </w:pPr>
       <w:r>
-        <w:t>Thanks to HAAI++ faculty and the MedGemma, Llama, LangGraph and Ollama communities. Teaching images are public; accompanying notes are fictional.</w:t>
+        <w:rPr>
+          <w:rFonts w:ascii="Times New Roman" w:hAnsi="Times New Roman" w:eastAsia="Times New Roman"/>
+          <w:b w:val="0"/>
+          <w:i w:val="0"/>
+          <w:color w:val="000000"/>
+          <w:sz w:val="24"/>
+        </w:rPr>
+        <w:t>Thanks to HAAI++ faculty for the HPPCS[04] brief and to the MedGemma, Llama, LangGraph, and Ollama communities. Teaching images are public; accompanying notes are fictional.</w:t>
       </w:r>
     </w:p>
     <w:sectPr>
+      <w:footerReference w:type="default" r:id="rId9"/>
       <w:pgSz w:w="12240" w:h="15840"/>
-      <w:pgMar w:top="1440" w:right="1440" w:bottom="1440" w:left="1440" w:header="720" w:footer="720" w:gutter="0"/>
+      <w:pgMar w:top="1008" w:right="1224" w:bottom="1008" w:left="1224" w:header="720" w:footer="720" w:gutter="0"/>
       <w:cols w:space="720"/>
       <w:docGrid w:linePitch="360"/>
     </w:sectPr>
   </w:body>
 </w:document>
+</file>
+
+<file path=word/footer1.xml><?xml version="1.0" encoding="utf-8"?>
+<w:ftr xmlns:m="http://schemas.openxmlformats.org/officeDocument/2006/math" xmlns:mc="http://schemas.openxmlformats.org/markup-compatibility/2006" xmlns:mo="http://schemas.microsoft.com/office/mac/office/2008/main" xmlns:mv="urn:schemas-microsoft-com:mac:vml" xmlns:o="urn:schemas-microsoft-com:office:office" xmlns:r="http://schemas.openxmlformats.org/officeDocument/2006/relationships" xmlns:v="urn:schemas-microsoft-com:vml" xmlns:w10="urn:schemas-microsoft-com:office:word" xmlns:w14="http://schemas.microsoft.com/office/word/2010/wordml" xmlns:w="http://schemas.openxmlformats.org/wordprocessingml/2006/main" xmlns:wne="http://schemas.microsoft.com/office/word/2006/wordml" xmlns:wp14="http://schemas.microsoft.com/office/word/2010/wordprocessingDrawing" xmlns:wp="http://schemas.openxmlformats.org/drawingml/2006/wordprocessingDrawing" xmlns:wpc="http://schemas.microsoft.com/office/word/2010/wordprocessingCanvas" xmlns:wpg="http://schemas.microsoft.com/office/word/2010/wordprocessingGroup" xmlns:wpi="http://schemas.microsoft.com/office/word/2010/wordprocessingInk" xmlns:wps="http://schemas.microsoft.com/office/word/2010/wordprocessingShape" mc:Ignorable="w14 wp14">
+  <w:p>
+    <w:pPr>
+      <w:pStyle w:val="Footer"/>
+      <w:jc w:val="center"/>
+    </w:pPr>
+    <w:r>
+      <w:rPr>
+        <w:rFonts w:ascii="Times New Roman" w:hAnsi="Times New Roman" w:eastAsia="Times New Roman"/>
+        <w:b w:val="0"/>
+        <w:i w:val="0"/>
+        <w:color w:val="000000"/>
+        <w:sz w:val="20"/>
+      </w:rPr>
+      <w:fldChar w:fldCharType="begin"/>
+      <w:instrText xml:space="preserve"> PAGE </w:instrText>
+      <w:fldChar w:fldCharType="end"/>
+    </w:r>
+  </w:p>
+</w:ftr>
 </file>
 
 <file path=word/numbering.xml><?xml version="1.0" encoding="utf-8"?>
@@ -667,6 +1148,10 @@
     <w:name w:val="Normal"/>
     <w:qFormat/>
     <w:rsid w:val="00FC693F"/>
+    <w:rPr>
+      <w:rFonts w:ascii="Times New Roman" w:hAnsi="Times New Roman"/>
+      <w:sz w:val="24"/>
+    </w:rPr>
   </w:style>
   <w:style w:type="paragraph" w:styleId="Header">
     <w:name w:val="header"/>

</xml_diff>

<commit_message>
Snapshot HPPCS[04] submission: CLI-only assistant with conversation.json output.
Remove FastAPI GUI and external guideline search; keep MedGemma+Llama LangGraph pipeline, follow-up chat, label-free metrics, and 3-page report.
</commit_message>
<xml_diff>
--- a/Report/Report.docx
+++ b/Report/Report.docx
@@ -4,7 +4,7 @@
   <w:body>
     <w:p>
       <w:pPr>
-        <w:spacing w:line="360" w:lineRule="auto" w:after="200" w:before="0"/>
+        <w:spacing w:line="360" w:lineRule="auto" w:after="120" w:before="0"/>
         <w:jc w:val="center"/>
       </w:pPr>
       <w:r>
@@ -13,14 +13,14 @@
           <w:b/>
           <w:i w:val="0"/>
           <w:color w:val="000000"/>
-          <w:sz w:val="32"/>
+          <w:sz w:val="30"/>
         </w:rPr>
         <w:t>Multimodal Medical Assistant for Image-Text Clinical Triage</w:t>
       </w:r>
     </w:p>
     <w:p>
       <w:pPr>
-        <w:spacing w:line="360" w:lineRule="auto" w:after="240" w:before="0"/>
+        <w:spacing w:line="360" w:lineRule="auto" w:after="160" w:before="0"/>
         <w:jc w:val="center"/>
       </w:pPr>
       <w:r>
@@ -36,7 +36,7 @@
     </w:p>
     <w:p>
       <w:pPr>
-        <w:spacing w:line="360" w:lineRule="auto" w:after="120" w:before="0"/>
+        <w:spacing w:line="360" w:lineRule="auto" w:after="60" w:before="0"/>
       </w:pPr>
       <w:r>
         <w:rPr>
@@ -51,7 +51,7 @@
     </w:p>
     <w:p>
       <w:pPr>
-        <w:spacing w:line="360" w:lineRule="auto" w:after="120" w:before="0"/>
+        <w:spacing w:line="360" w:lineRule="auto" w:after="80" w:before="0"/>
       </w:pPr>
       <w:r>
         <w:rPr>
@@ -61,12 +61,12 @@
           <w:color w:val="000000"/>
           <w:sz w:val="24"/>
         </w:rPr>
-        <w:t>This project implements a clinician-facing multimodal assistant that combines a radiology scan or histopathology slide with a structured clinical note to produce triage guidance, image–text correlation, evidence-linked summaries, and interactive follow-up chat. The clinical aim is to reduce missed cross-modal cues by forcing vision and text models to share one case record. Compact local models are used deliberately: MedGemma 4B for vision and Llama 3.2 (3B, with 1B fallback) for text reasoning. These sizes were chosen for memory efficiency so the stack runs on a typical 16 GB CPU laptop or on Google Colab (CPU or free T4 GPU), reducing cost, energy use, and data movement compared with large cloud-only multimodal APIs. Ollama auto-adapts to CPU or GPU; the app unloads the vision model after analysis so both LLMs share limited RAM/VRAM. Modalities are restricted to radiology and pathology with auto domain detection. LangGraph sequences analysis and follow-up re-triage. Uploads are de-identified before storage. Evaluation metrics appear in the TUI and GUI after every upload. Dual interfaces share this backend.</w:t>
+        <w:t>This project implements a clinician-facing multimodal assistant that combines a radiology scan or histopathology slide with a structured clinical note to produce triage guidance, image–text correlation, evidence-linked summaries, and interactive follow-up chat. The clinical aim is to reduce missed cross-modal cues by forcing vision and text models to share one case record. Compact local models are used deliberately: MedGemma 4B for vision and Llama 3.2 (3B, with 1B fallback) for text reasoning, chosen for memory efficiency on a typical 16 GB CPU laptop or Google Colab (CPU or free T4 GPU). Ollama auto-adapts to CPU or GPU; the app unloads the vision model after analysis so both LLMs share limited RAM/VRAM. Modalities are restricted to radiology and pathology with auto domain detection. LangGraph sequences analysis and follow-up re-triage. The CLI takes --text and --image paths, prints triage summaries, continues into follow-up chat, and writes conversation.json in the Codebase directory; optional --tui offers the same pipeline with interactive path prompts. Label-free evaluation metrics are printed after every run.</w:t>
       </w:r>
     </w:p>
     <w:p>
       <w:pPr>
-        <w:spacing w:line="360" w:lineRule="auto" w:after="120" w:before="0"/>
+        <w:spacing w:line="360" w:lineRule="auto" w:after="60" w:before="0"/>
       </w:pPr>
       <w:r>
         <w:rPr>
@@ -82,7 +82,7 @@
     <w:p>
       <w:pPr>
         <w:pStyle w:val="ListBullet"/>
-        <w:spacing w:line="360" w:lineRule="auto" w:after="40"/>
+        <w:spacing w:line="360" w:lineRule="auto" w:after="20" w:before="0"/>
       </w:pPr>
       <w:r>
         <w:rPr>
@@ -92,13 +92,13 @@
           <w:color w:val="000000"/>
           <w:sz w:val="24"/>
         </w:rPr>
-        <w:t>Context and background: Imaging and notes are usually read in separate tools. This system binds them in one LangGraph state so triage uses both visual findings and vitals or history.</w:t>
+        <w:t>Context: Imaging and notes are usually read separately; this system binds them in one LangGraph state so triage uses visual findings and note context together.</w:t>
       </w:r>
     </w:p>
     <w:p>
       <w:pPr>
         <w:pStyle w:val="ListBullet"/>
-        <w:spacing w:line="360" w:lineRule="auto" w:after="40"/>
+        <w:spacing w:line="360" w:lineRule="auto" w:after="20" w:before="0"/>
       </w:pPr>
       <w:r>
         <w:rPr>
@@ -108,12 +108,12 @@
           <w:color w:val="000000"/>
           <w:sz w:val="24"/>
         </w:rPr>
-        <w:t>Motivation: Local MedGemma + Llama on Ollama keep PHI on-premises and match the HPPCS[04] multimodal brief.</w:t>
+        <w:t>Motivation: Local MedGemma + Llama on Ollama keep PHI on-premises and match HPPCS[04].</w:t>
       </w:r>
     </w:p>
     <w:p>
       <w:pPr>
-        <w:spacing w:line="360" w:lineRule="auto" w:after="120" w:before="0"/>
+        <w:spacing w:line="360" w:lineRule="auto" w:after="60" w:before="0"/>
       </w:pPr>
       <w:r>
         <w:rPr>
@@ -128,7 +128,7 @@
     </w:p>
     <w:p>
       <w:pPr>
-        <w:spacing w:line="360" w:lineRule="auto" w:after="120" w:before="0"/>
+        <w:spacing w:line="360" w:lineRule="auto" w:after="80" w:before="0"/>
       </w:pPr>
       <w:r>
         <w:rPr>
@@ -138,12 +138,12 @@
           <w:color w:val="000000"/>
           <w:sz w:val="24"/>
         </w:rPr>
-        <w:t>Given one radiology or pathology image and one clinical note, the system must (i) detect domain, (ii) correlate image findings with the note, (iii) assign triage (emergency / urgent / soon / routine), (iv) answer clinician follow-up questions with updated recommendations, and (v) report evaluation and interface metrics. Out-of-scope photographs (dermatology, fundus, clinical snapshots) must be rejected.</w:t>
+        <w:t>Given one radiology or pathology image and one clinical note, the system must detect domain, correlate image findings with the note, assign triage (emergency / urgent / soon / routine), answer follow-up questions with updated recommendations, and report evaluation metrics. Out-of-scope photographs (dermatology, fundus, clinical snapshots) are rejected.</w:t>
       </w:r>
     </w:p>
     <w:p>
       <w:pPr>
-        <w:spacing w:line="360" w:lineRule="auto" w:after="120" w:before="0"/>
+        <w:spacing w:line="360" w:lineRule="auto" w:after="60" w:before="0"/>
       </w:pPr>
       <w:r>
         <w:rPr>
@@ -159,7 +159,7 @@
     <w:p>
       <w:pPr>
         <w:pStyle w:val="ListBullet"/>
-        <w:spacing w:line="360" w:lineRule="auto" w:after="40"/>
+        <w:spacing w:line="360" w:lineRule="auto" w:after="20" w:before="0"/>
       </w:pPr>
       <w:r>
         <w:rPr>
@@ -169,13 +169,13 @@
           <w:color w:val="000000"/>
           <w:sz w:val="24"/>
         </w:rPr>
-        <w:t>Provide a TUI and a GUI so clinicians can upload a note and image, ask questions, and receive triage summaries.</w:t>
+        <w:t>Provide a CLI (and optional TUI) so clinicians pass a note and image path and receive triage summaries.</w:t>
       </w:r>
     </w:p>
     <w:p>
       <w:pPr>
         <w:pStyle w:val="ListBullet"/>
-        <w:spacing w:line="360" w:lineRule="auto" w:after="40"/>
+        <w:spacing w:line="360" w:lineRule="auto" w:after="20" w:before="0"/>
       </w:pPr>
       <w:r>
         <w:rPr>
@@ -185,13 +185,13 @@
           <w:color w:val="000000"/>
           <w:sz w:val="24"/>
         </w:rPr>
-        <w:t>Return image-referenced findings, note context, and numbered guideline citations.</w:t>
+        <w:t>Return image-referenced findings and contextual explanations from the clinical note.</w:t>
       </w:r>
     </w:p>
     <w:p>
       <w:pPr>
         <w:pStyle w:val="ListBullet"/>
-        <w:spacing w:line="360" w:lineRule="auto" w:after="40"/>
+        <w:spacing w:line="360" w:lineRule="auto" w:after="20" w:before="0"/>
       </w:pPr>
       <w:r>
         <w:rPr>
@@ -207,7 +207,7 @@
     <w:p>
       <w:pPr>
         <w:pStyle w:val="ListBullet"/>
-        <w:spacing w:line="360" w:lineRule="auto" w:after="40"/>
+        <w:spacing w:line="360" w:lineRule="auto" w:after="20" w:before="0"/>
       </w:pPr>
       <w:r>
         <w:rPr>
@@ -223,7 +223,7 @@
     <w:p>
       <w:pPr>
         <w:pStyle w:val="ListBullet"/>
-        <w:spacing w:line="360" w:lineRule="auto" w:after="40"/>
+        <w:spacing w:line="360" w:lineRule="auto" w:after="20" w:before="0"/>
       </w:pPr>
       <w:r>
         <w:rPr>
@@ -233,13 +233,13 @@
           <w:color w:val="000000"/>
           <w:sz w:val="24"/>
         </w:rPr>
-        <w:t>De-identify text and images before any model call or disk write.</w:t>
+        <w:t>De-identify text and images before any model call.</w:t>
       </w:r>
     </w:p>
     <w:p>
       <w:pPr>
         <w:pStyle w:val="ListBullet"/>
-        <w:spacing w:line="360" w:lineRule="auto" w:after="40"/>
+        <w:spacing w:line="360" w:lineRule="auto" w:after="20" w:before="0"/>
       </w:pPr>
       <w:r>
         <w:rPr>
@@ -249,12 +249,28 @@
           <w:color w:val="000000"/>
           <w:sz w:val="24"/>
         </w:rPr>
-        <w:t>Emit evaluation metrics (correlation, robustness, explanation quality, satisfaction) on every upload.</w:t>
+        <w:t>Emit evaluation metrics (correlation, robustness, explanation quality, satisfaction) on every run.</w:t>
       </w:r>
     </w:p>
     <w:p>
       <w:pPr>
-        <w:spacing w:line="360" w:lineRule="auto" w:after="120" w:before="0"/>
+        <w:pStyle w:val="ListBullet"/>
+        <w:spacing w:line="360" w:lineRule="auto" w:after="20" w:before="0"/>
+      </w:pPr>
+      <w:r>
+        <w:rPr>
+          <w:rFonts w:ascii="Times New Roman" w:hAnsi="Times New Roman" w:eastAsia="Times New Roman"/>
+          <w:b w:val="0"/>
+          <w:i w:val="0"/>
+          <w:color w:val="000000"/>
+          <w:sz w:val="24"/>
+        </w:rPr>
+        <w:t>Write the conversation output as conversation.json in the Codebase directory.</w:t>
+      </w:r>
+    </w:p>
+    <w:p>
+      <w:pPr>
+        <w:spacing w:line="360" w:lineRule="auto" w:after="60" w:before="0"/>
       </w:pPr>
       <w:r>
         <w:rPr>
@@ -270,7 +286,7 @@
     <w:p>
       <w:pPr>
         <w:pStyle w:val="ListBullet"/>
-        <w:spacing w:line="360" w:lineRule="auto" w:after="40"/>
+        <w:spacing w:line="360" w:lineRule="auto" w:after="20" w:before="0"/>
       </w:pPr>
       <w:r>
         <w:rPr>
@@ -280,13 +296,13 @@
           <w:color w:val="000000"/>
           <w:sz w:val="24"/>
         </w:rPr>
-        <w:t>Tools and technologies: Python 3.12, FastAPI/Uvicorn, LangGraph, Ollama HTTP API, MedGemma 4B (vision), Llama 3.2 3B (text; 1B fallback), runtime_profile.py, python-docx.</w:t>
+        <w:t>Stack: Python 3.12, LangGraph, Ollama, MedGemma 4B, Llama 3.2 3B, runtime_profile.py.</w:t>
       </w:r>
     </w:p>
     <w:p>
       <w:pPr>
         <w:pStyle w:val="ListBullet"/>
-        <w:spacing w:line="360" w:lineRule="auto" w:after="40"/>
+        <w:spacing w:line="360" w:lineRule="auto" w:after="20" w:before="0"/>
       </w:pPr>
       <w:r>
         <w:rPr>
@@ -296,12 +312,12 @@
           <w:color w:val="000000"/>
           <w:sz w:val="24"/>
         </w:rPr>
-        <w:t>Workflow: ingest_pair de-identifies files → medgemma_analyze (domain + findings) → llama_entities → llama_reason (triage JSON) → llama_converse (cited summary) → optional chat (refresh_reasoning_after_follow_up). Metrics by evaluation.py.</w:t>
+        <w:t>Workflow: de-identify → MedGemma (domain + findings) → Llama entities → Llama triage JSON → summary → follow-up re-triage; metrics via evaluation.py.</w:t>
       </w:r>
     </w:p>
     <w:p>
       <w:pPr>
-        <w:spacing w:line="360" w:lineRule="auto" w:after="120" w:before="0"/>
+        <w:spacing w:line="360" w:lineRule="auto" w:after="80" w:before="0"/>
       </w:pPr>
       <w:r>
         <w:rPr>
@@ -311,12 +327,12 @@
           <w:color w:val="000000"/>
           <w:sz w:val="24"/>
         </w:rPr>
-        <w:t>Conceptual pipeline: Note+Image → Privacy gate → MedGemma → Llama entities → Llama triage → Clinician summary → Follow-up re-triage → Evaluation panel in TUI/GUI.</w:t>
+        <w:t>Pipeline: Note+Image → Privacy → MedGemma → Llama → conversation.json → follow-up chat.</w:t>
       </w:r>
     </w:p>
     <w:p>
       <w:pPr>
-        <w:spacing w:line="360" w:lineRule="auto" w:after="120" w:before="0"/>
+        <w:spacing w:line="360" w:lineRule="auto" w:after="60" w:before="0"/>
       </w:pPr>
       <w:r>
         <w:rPr>
@@ -331,7 +347,7 @@
     </w:p>
     <w:p>
       <w:pPr>
-        <w:spacing w:line="360" w:lineRule="auto" w:after="120" w:before="0"/>
+        <w:spacing w:line="360" w:lineRule="auto" w:after="40" w:before="0"/>
       </w:pPr>
       <w:r>
         <w:rPr>
@@ -341,13 +357,13 @@
           <w:color w:val="000000"/>
           <w:sz w:val="24"/>
         </w:rPr>
-        <w:t>Architecture (layers): Presentation (tui_app.py, upload_app.py) → Application (medical_assistant.py sessions) → Orchestration (graph_pipeline.py LangGraph) → Models (ollama_client.py load/unload) → Data (ingestion.py, privacy.py, entity_normalizer.py, clinical_references.py, evaluation.py). sample_data/ sits outside Codebase; live sessions are Codebase/uploads/processed/&lt;id&gt;/.</w:t>
+        <w:t>Architecture (layers): Presentation (main.py CLI and optional tui_app.py) → Application (medical_assistant.py) → Orchestration (graph_pipeline.py / LangGraph) → Models (ollama_client.py with runtime_profile.py for CPU/GPU) → Supporting modules (ingestion.py, privacy.py, evaluation.py, paths.py). After each run, medical_assistant.py writes conversation.json in the Codebase directory.</w:t>
       </w:r>
     </w:p>
     <w:p>
       <w:pPr>
         <w:pStyle w:val="ListBullet"/>
-        <w:spacing w:line="360" w:lineRule="auto" w:after="40"/>
+        <w:spacing w:line="360" w:lineRule="auto" w:after="20" w:before="0"/>
       </w:pPr>
       <w:r>
         <w:rPr>
@@ -357,13 +373,13 @@
           <w:color w:val="000000"/>
           <w:sz w:val="24"/>
         </w:rPr>
-        <w:t>main.py — Mode 1 TUI / Mode 2 GUI; --device auto|cpu|gpu; Ollama model checks.</w:t>
+        <w:t>main.py — CLI with --text and --image; follow-up chat after analysis; optional --tui; --device auto|cpu|gpu.</w:t>
       </w:r>
     </w:p>
     <w:p>
       <w:pPr>
         <w:pStyle w:val="ListBullet"/>
-        <w:spacing w:line="360" w:lineRule="auto" w:after="40"/>
+        <w:spacing w:line="360" w:lineRule="auto" w:after="20" w:before="0"/>
       </w:pPr>
       <w:r>
         <w:rPr>
@@ -373,13 +389,13 @@
           <w:color w:val="000000"/>
           <w:sz w:val="24"/>
         </w:rPr>
-        <w:t>runtime_profile.py — detects NVIDIA GPU vs CPU; tunes keep-alive, timeouts, unload policy.</w:t>
+        <w:t>runtime_profile.py — detects NVIDIA GPU vs CPU; tunes keep-alive, timeouts, and unload policy.</w:t>
       </w:r>
     </w:p>
     <w:p>
       <w:pPr>
         <w:pStyle w:val="ListBullet"/>
-        <w:spacing w:line="360" w:lineRule="auto" w:after="40"/>
+        <w:spacing w:line="360" w:lineRule="auto" w:after="20" w:before="0"/>
       </w:pPr>
       <w:r>
         <w:rPr>
@@ -389,13 +405,13 @@
           <w:color w:val="000000"/>
           <w:sz w:val="24"/>
         </w:rPr>
-        <w:t>graph_pipeline.py — four-node graph; follow-up JSON re-triage and citations.</w:t>
+        <w:t>graph_pipeline.py — four-node LangGraph; follow-up re-triage grounded in image and note.</w:t>
       </w:r>
     </w:p>
     <w:p>
       <w:pPr>
         <w:pStyle w:val="ListBullet"/>
-        <w:spacing w:line="360" w:lineRule="auto" w:after="40"/>
+        <w:spacing w:line="360" w:lineRule="auto" w:after="20" w:before="0"/>
       </w:pPr>
       <w:r>
         <w:rPr>
@@ -405,13 +421,13 @@
           <w:color w:val="000000"/>
           <w:sz w:val="24"/>
         </w:rPr>
-        <w:t>evaluation.py — correlation, robustness, explanation, and satisfaction metrics.</w:t>
+        <w:t>evaluation.py — correlation, robustness, explanation quality, and satisfaction metrics.</w:t>
       </w:r>
     </w:p>
     <w:p>
       <w:pPr>
         <w:pStyle w:val="ListBullet"/>
-        <w:spacing w:line="360" w:lineRule="auto" w:after="40"/>
+        <w:spacing w:line="360" w:lineRule="auto" w:after="20" w:before="0"/>
       </w:pPr>
       <w:r>
         <w:rPr>
@@ -421,12 +437,28 @@
           <w:color w:val="000000"/>
           <w:sz w:val="24"/>
         </w:rPr>
-        <w:t>upload_app.py / tui_app.py — dashboard and terminal chat; metrics panel in both.</w:t>
+        <w:t>tui_app.py — shared terminal summary and follow-up chat loop used by CLI and --tui.</w:t>
       </w:r>
     </w:p>
     <w:p>
       <w:pPr>
-        <w:spacing w:line="360" w:lineRule="auto" w:after="120" w:before="0"/>
+        <w:pStyle w:val="ListBullet"/>
+        <w:spacing w:line="360" w:lineRule="auto" w:after="20" w:before="0"/>
+      </w:pPr>
+      <w:r>
+        <w:rPr>
+          <w:rFonts w:ascii="Times New Roman" w:hAnsi="Times New Roman" w:eastAsia="Times New Roman"/>
+          <w:b w:val="0"/>
+          <w:i w:val="0"/>
+          <w:color w:val="000000"/>
+          <w:sz w:val="24"/>
+        </w:rPr>
+        <w:t>execution.txt — setup and run instructions for the submission.</w:t>
+      </w:r>
+    </w:p>
+    <w:p>
+      <w:pPr>
+        <w:spacing w:line="360" w:lineRule="auto" w:after="60" w:before="0"/>
       </w:pPr>
       <w:r>
         <w:rPr>
@@ -441,7 +473,7 @@
     </w:p>
     <w:p>
       <w:pPr>
-        <w:spacing w:line="360" w:lineRule="auto" w:after="120" w:before="0"/>
+        <w:spacing w:line="360" w:lineRule="auto" w:after="60" w:before="0"/>
       </w:pPr>
       <w:r>
         <w:rPr>
@@ -451,12 +483,12 @@
           <w:color w:val="000000"/>
           <w:sz w:val="24"/>
         </w:rPr>
-        <w:t>Evaluation is performed during a live run through Mode 1 (TUI) or Mode 2 (GUI): upload, analysis, follow-up chat, and the Evaluation panel. Faculty or clinicians may supply their own de-identified note and image at demo time.</w:t>
+        <w:t>Evaluation is performed during a live CLI or TUI run: pass note and image paths, wait for analysis, continue follow-up chat at the You&gt; prompt, then read printed metrics and Codebase/conversation.json. Faculty may supply their own note and image at demo time.</w:t>
       </w:r>
     </w:p>
     <w:p>
       <w:pPr>
-        <w:spacing w:line="360" w:lineRule="auto" w:after="120" w:before="0"/>
+        <w:spacing w:line="360" w:lineRule="auto" w:after="40" w:before="0"/>
       </w:pPr>
       <w:r>
         <w:rPr>
@@ -466,12 +498,13 @@
           <w:color w:val="000000"/>
           <w:sz w:val="24"/>
         </w:rPr>
-        <w:t>Qualitative observations on representative radiology and pathology uploads include: MedGemma correctly distinguishes radiology versus pathology domains; Llama produces structured triage (emergency / urgent / soon / routine) with impression, differential, and recommendations; image–note correlation text links visual findings to note context; clinical_references.py attaches WHO/NIH-style guideline links; and follow-up questions trigger re-triage with updated recommendations and cited replies.</w:t>
+        <w:t>On representative radiology and pathology cases, MedGemma distinguishes domains; Llama returns structured triage (emergency / urgent / soon / routine) with impression, differential, and recommendations; image–note correlation links findings to the note; and follow-up questions trigger re-triage. Quantitative metrics from evaluation.py:</w:t>
       </w:r>
     </w:p>
     <w:p>
       <w:pPr>
-        <w:spacing w:line="360" w:lineRule="auto" w:after="120" w:before="0"/>
+        <w:pStyle w:val="ListBullet"/>
+        <w:spacing w:line="360" w:lineRule="auto" w:after="20" w:before="0"/>
       </w:pPr>
       <w:r>
         <w:rPr>
@@ -481,13 +514,13 @@
           <w:color w:val="000000"/>
           <w:sz w:val="24"/>
         </w:rPr>
-        <w:t>Quantitative results are computed by evaluation.py on each upload and shown in the Evaluation panel:</w:t>
+        <w:t>Cross-modal correlation — image–note narrative presence and token overlap.</w:t>
       </w:r>
     </w:p>
     <w:p>
       <w:pPr>
         <w:pStyle w:val="ListBullet"/>
-        <w:spacing w:line="360" w:lineRule="auto" w:after="40"/>
+        <w:spacing w:line="360" w:lineRule="auto" w:after="20" w:before="0"/>
       </w:pPr>
       <w:r>
         <w:rPr>
@@ -497,13 +530,13 @@
           <w:color w:val="000000"/>
           <w:sz w:val="24"/>
         </w:rPr>
-        <w:t>Cross-modal correlation — presence of an image–note narrative and token overlap between findings and note.</w:t>
+        <w:t>Robustness — valid domain detection, de-identified processing, and field completeness.</w:t>
       </w:r>
     </w:p>
     <w:p>
       <w:pPr>
         <w:pStyle w:val="ListBullet"/>
-        <w:spacing w:line="360" w:lineRule="auto" w:after="40"/>
+        <w:spacing w:line="360" w:lineRule="auto" w:after="20" w:before="0"/>
       </w:pPr>
       <w:r>
         <w:rPr>
@@ -513,13 +546,13 @@
           <w:color w:val="000000"/>
           <w:sz w:val="24"/>
         </w:rPr>
-        <w:t>Robustness — valid domain detection, de-identified storage, and completeness of required output fields.</w:t>
+        <w:t>Explanation quality — checklist of clinical explanation fields (mapped to 1–5 Likert).</w:t>
       </w:r>
     </w:p>
     <w:p>
       <w:pPr>
         <w:pStyle w:val="ListBullet"/>
-        <w:spacing w:line="360" w:lineRule="auto" w:after="40"/>
+        <w:spacing w:line="360" w:lineRule="auto" w:after="20" w:before="0"/>
       </w:pPr>
       <w:r>
         <w:rPr>
@@ -529,13 +562,12 @@
           <w:color w:val="000000"/>
           <w:sz w:val="24"/>
         </w:rPr>
-        <w:t>Explanation quality — checklist over impression, rationale, findings, correlation, recommendations, references, and follow-up prompts (mapped to a 1–5 Likert).</w:t>
+        <w:t>User satisfaction — interface completeness proxy from triage, findings, chat, and prompts.</w:t>
       </w:r>
     </w:p>
     <w:p>
       <w:pPr>
-        <w:pStyle w:val="ListBullet"/>
-        <w:spacing w:line="360" w:lineRule="auto" w:after="40"/>
+        <w:spacing w:line="360" w:lineRule="auto" w:after="80" w:before="0"/>
       </w:pPr>
       <w:r>
         <w:rPr>
@@ -545,27 +577,12 @@
           <w:color w:val="000000"/>
           <w:sz w:val="24"/>
         </w:rPr>
-        <w:t>User satisfaction — interface completeness proxy from triage, findings, chat, prompt chips, and guideline links (1–5 Likert).</w:t>
+        <w:t>Demo command: python main.py --text &lt;note.txt&gt; --image &lt;scan.jpg&gt; from Codebase/.</w:t>
       </w:r>
     </w:p>
     <w:p>
       <w:pPr>
-        <w:spacing w:line="360" w:lineRule="auto" w:after="120" w:before="0"/>
-      </w:pPr>
-      <w:r>
-        <w:rPr>
-          <w:rFonts w:ascii="Times New Roman" w:hAnsi="Times New Roman" w:eastAsia="Times New Roman"/>
-          <w:b w:val="0"/>
-          <w:i w:val="0"/>
-          <w:color w:val="000000"/>
-          <w:sz w:val="24"/>
-        </w:rPr>
-        <w:t>For demonstration, run python main.py, choose TUI or GUI, upload one radiology or pathology case, and read the four scores in the Evaluation section alongside triage output and follow-up chat.</w:t>
-      </w:r>
-    </w:p>
-    <w:p>
-      <w:pPr>
-        <w:spacing w:line="360" w:lineRule="auto" w:after="120" w:before="0"/>
+        <w:spacing w:line="360" w:lineRule="auto" w:after="60" w:before="0"/>
       </w:pPr>
       <w:r>
         <w:rPr>
@@ -581,7 +598,7 @@
     <w:p>
       <w:pPr>
         <w:pStyle w:val="ListBullet"/>
-        <w:spacing w:line="360" w:lineRule="auto" w:after="40"/>
+        <w:spacing w:line="360" w:lineRule="auto" w:after="20" w:before="0"/>
       </w:pPr>
       <w:r>
         <w:rPr>
@@ -591,13 +608,13 @@
           <w:color w:val="000000"/>
           <w:sz w:val="24"/>
         </w:rPr>
-        <w:t>Summary of contributions: dual-LLM multimodal triage with auto domain detection, privacy gate, dual clinician interfaces, adaptive cited follow-up, and evaluation metric outputs.</w:t>
+        <w:t>Summary of contributions: dual-LLM multimodal triage with auto domain detection, privacy gate, CLI (and optional TUI), adaptive follow-up, and evaluation metric outputs.</w:t>
       </w:r>
     </w:p>
     <w:p>
       <w:pPr>
         <w:pStyle w:val="ListBullet"/>
-        <w:spacing w:line="360" w:lineRule="auto" w:after="40"/>
+        <w:spacing w:line="360" w:lineRule="auto" w:after="20" w:before="0"/>
       </w:pPr>
       <w:r>
         <w:rPr>
@@ -607,12 +624,12 @@
           <w:color w:val="000000"/>
           <w:sz w:val="24"/>
         </w:rPr>
-        <w:t>Possible extensions: larger GPU serving when hardware allows, reader-study Likert collection from clinicians, and SNOMED coding via entity_normalizer.py.</w:t>
+        <w:t>Possible extensions: larger GPU serving when hardware allows, and reader-study Likert collection from clinicians.</w:t>
       </w:r>
     </w:p>
     <w:p>
       <w:pPr>
-        <w:spacing w:line="360" w:lineRule="auto" w:after="120" w:before="0"/>
+        <w:spacing w:line="360" w:lineRule="auto" w:after="60" w:before="0"/>
       </w:pPr>
       <w:r>
         <w:rPr>
@@ -622,13 +639,13 @@
           <w:color w:val="000000"/>
           <w:sz w:val="24"/>
         </w:rPr>
-        <w:t>9. References</w:t>
+        <w:t>8. References</w:t>
       </w:r>
     </w:p>
     <w:p>
       <w:pPr>
         <w:pStyle w:val="ListBullet"/>
-        <w:spacing w:line="360" w:lineRule="auto" w:after="40"/>
+        <w:spacing w:line="360" w:lineRule="auto" w:after="20" w:before="0"/>
       </w:pPr>
       <w:r>
         <w:rPr>
@@ -644,7 +661,7 @@
     <w:p>
       <w:pPr>
         <w:pStyle w:val="ListBullet"/>
-        <w:spacing w:line="360" w:lineRule="auto" w:after="40"/>
+        <w:spacing w:line="360" w:lineRule="auto" w:after="20" w:before="0"/>
       </w:pPr>
       <w:r>
         <w:rPr>
@@ -660,7 +677,7 @@
     <w:p>
       <w:pPr>
         <w:pStyle w:val="ListBullet"/>
-        <w:spacing w:line="360" w:lineRule="auto" w:after="40"/>
+        <w:spacing w:line="360" w:lineRule="auto" w:after="20" w:before="0"/>
       </w:pPr>
       <w:r>
         <w:rPr>
@@ -670,13 +687,13 @@
           <w:color w:val="000000"/>
           <w:sz w:val="24"/>
         </w:rPr>
-        <w:t>Meta, Llama 3.2 model card; Ollama library (medgemma, llama3.2).</w:t>
+        <w:t>Meta Llama 3.2 model card; Ollama library (medgemma, llama3.2).</w:t>
       </w:r>
     </w:p>
     <w:p>
       <w:pPr>
         <w:pStyle w:val="ListBullet"/>
-        <w:spacing w:line="360" w:lineRule="auto" w:after="40"/>
+        <w:spacing w:line="360" w:lineRule="auto" w:after="20" w:before="0"/>
       </w:pPr>
       <w:r>
         <w:rPr>
@@ -686,44 +703,12 @@
           <w:color w:val="000000"/>
           <w:sz w:val="24"/>
         </w:rPr>
-        <w:t>LangGraph documentation, https://langchain-ai.github.io/langgraph/</w:t>
+        <w:t>LangGraph documentation; Wikimedia Commons teaching images in sample_data/.</w:t>
       </w:r>
     </w:p>
     <w:p>
       <w:pPr>
-        <w:pStyle w:val="ListBullet"/>
-        <w:spacing w:line="360" w:lineRule="auto" w:after="40"/>
-      </w:pPr>
-      <w:r>
-        <w:rPr>
-          <w:rFonts w:ascii="Times New Roman" w:hAnsi="Times New Roman" w:eastAsia="Times New Roman"/>
-          <w:b w:val="0"/>
-          <w:i w:val="0"/>
-          <w:color w:val="000000"/>
-          <w:sz w:val="24"/>
-        </w:rPr>
-        <w:t>WHO/NIH public guideline pages linked from clinical_references.py.</w:t>
-      </w:r>
-    </w:p>
-    <w:p>
-      <w:pPr>
-        <w:pStyle w:val="ListBullet"/>
-        <w:spacing w:line="360" w:lineRule="auto" w:after="40"/>
-      </w:pPr>
-      <w:r>
-        <w:rPr>
-          <w:rFonts w:ascii="Times New Roman" w:hAnsi="Times New Roman" w:eastAsia="Times New Roman"/>
-          <w:b w:val="0"/>
-          <w:i w:val="0"/>
-          <w:color w:val="000000"/>
-          <w:sz w:val="24"/>
-        </w:rPr>
-        <w:t>Wikimedia Commons teaching images; optional demo files in sample_data/.</w:t>
-      </w:r>
-    </w:p>
-    <w:p>
-      <w:pPr>
-        <w:spacing w:line="360" w:lineRule="auto" w:after="120" w:before="0"/>
+        <w:spacing w:line="360" w:lineRule="auto" w:after="60" w:before="0"/>
       </w:pPr>
       <w:r>
         <w:rPr>
@@ -738,7 +723,7 @@
     </w:p>
     <w:p>
       <w:pPr>
-        <w:spacing w:line="360" w:lineRule="auto" w:after="120" w:before="0"/>
+        <w:spacing w:line="360" w:lineRule="auto" w:after="40" w:before="0"/>
       </w:pPr>
       <w:r>
         <w:rPr>
@@ -754,7 +739,7 @@
     <w:sectPr>
       <w:footerReference w:type="default" r:id="rId9"/>
       <w:pgSz w:w="12240" w:h="15840"/>
-      <w:pgMar w:top="1008" w:right="1224" w:bottom="1008" w:left="1224" w:header="720" w:footer="720" w:gutter="0"/>
+      <w:pgMar w:top="936" w:right="1152" w:bottom="936" w:left="1152" w:header="720" w:footer="720" w:gutter="0"/>
       <w:cols w:space="720"/>
       <w:docGrid w:linePitch="360"/>
     </w:sectPr>

</xml_diff>